<commit_message>
T9-18/T9-19: correct false claims about missing benchmark files and shipped UI
</commit_message>
<xml_diff>
--- a/docs/meetings/sprint8_sponsor_review.docx
+++ b/docs/meetings/sprint8_sponsor_review.docx
@@ -23,21 +23,12 @@
         <w:spacing w:after="80"/>
         <w:jc w:val="center"/>
       </w:pPr>
-      <w:proofErr w:type="spellStart"/>
       <w:r>
         <w:rPr>
           <w:b/>
           <w:bCs/>
         </w:rPr>
-        <w:t>EduRAG</w:t>
-      </w:r>
-      <w:proofErr w:type="spellEnd"/>
-      <w:r>
-        <w:rPr>
-          <w:b/>
-          <w:bCs/>
-        </w:rPr>
-        <w:t>: An AI-Powered Course Assistant Using Retrieval-Augmented Generation</w:t>
+        <w:t>EduRAG: An AI-Powered Course Assistant Using Retrieval-Augmented Generation</w:t>
       </w:r>
     </w:p>
     <w:p>
@@ -78,13 +69,7 @@
         <w:spacing w:after="80"/>
       </w:pPr>
       <w:r>
-        <w:t xml:space="preserve">Sprint 8 </w:t>
-      </w:r>
-      <w:r>
-        <w:t xml:space="preserve">ran from 18 August to 1 September 2026, </w:t>
-      </w:r>
-      <w:r>
-        <w:t>focused on hardening the system's security and infrastructure, wiring the remaining authentication and course-management backend, and completing role-based QA testing ahead of the tech expo and grader review. This document summarises the outcomes of the Sprint 8 sponsor review meeting held with Prof. Jun Yan on 02 September 2026.</w:t>
+        <w:t xml:space="preserve">Sprint 8 ran from 18 August to 1 September 2026, focused on hardening the system's security and infrastructure, wiring the remaining authentication and course-management backend, and completing role-based QA testing ahead of the tech expo and grader review. This document summarises the outcomes of the Sprint 8 sponsor review meeting held with Prof. Jun Yan on 02 September 2026.</w:t>
       </w:r>
     </w:p>
     <w:p>
@@ -139,15 +124,7 @@
         <w:spacing w:after="60"/>
       </w:pPr>
       <w:r>
-        <w:t>Added token requirements on /</w:t>
-      </w:r>
-      <w:proofErr w:type="spellStart"/>
-      <w:r>
-        <w:t>api</w:t>
-      </w:r>
-      <w:proofErr w:type="spellEnd"/>
-      <w:r>
-        <w:t>/metrics, /admin/stats, /admin/audit-logs and /logs, and stopped publishing services on 0.0.0.0.</w:t>
+        <w:t>Added token requirements on /api/metrics, /admin/stats, /admin/audit-logs and /logs, and stopped publishing services on 0.0.0.0.</w:t>
       </w:r>
     </w:p>
     <w:p>
@@ -160,23 +137,7 @@
         <w:spacing w:after="60"/>
       </w:pPr>
       <w:r>
-        <w:t xml:space="preserve">Rotated the Postgres password, disabled </w:t>
-      </w:r>
-      <w:proofErr w:type="spellStart"/>
-      <w:r>
-        <w:t>ChromaDB</w:t>
-      </w:r>
-      <w:proofErr w:type="spellEnd"/>
-      <w:r>
-        <w:t xml:space="preserve"> reset, and set up </w:t>
-      </w:r>
-      <w:proofErr w:type="spellStart"/>
-      <w:r>
-        <w:t>Tailscale</w:t>
-      </w:r>
-      <w:proofErr w:type="spellEnd"/>
-      <w:r>
-        <w:t xml:space="preserve"> so the team can reach the API, UI and database securely.</w:t>
+        <w:t xml:space="preserve">Rotated the Postgres password, disabled ChromaDB reset, and set up Tailscale so the team can reach the API, UI and database securely.</w:t>
       </w:r>
     </w:p>
     <w:p>
@@ -189,15 +150,7 @@
         <w:spacing w:after="60"/>
       </w:pPr>
       <w:r>
-        <w:t xml:space="preserve">Pointed PAEDIA_ALLOWED_ORIGIN at the </w:t>
-      </w:r>
-      <w:proofErr w:type="spellStart"/>
-      <w:r>
-        <w:t>Tailscale</w:t>
-      </w:r>
-      <w:proofErr w:type="spellEnd"/>
-      <w:r>
-        <w:t xml:space="preserve"> address and rotated demo account passwords, removing them from the login screen and README.</w:t>
+        <w:t xml:space="preserve">Pointed PAEDIA_ALLOWED_ORIGIN at the Tailscale address and rotated demo account passwords, removing them from the login screen and README.</w:t>
       </w:r>
     </w:p>
     <w:p>
@@ -223,23 +176,8 @@
         </w:numPr>
         <w:spacing w:after="60"/>
       </w:pPr>
-      <w:proofErr w:type="spellStart"/>
-      <w:r>
-        <w:t>Ollama</w:t>
-      </w:r>
-      <w:proofErr w:type="spellEnd"/>
-      <w:r>
-        <w:t xml:space="preserve"> now runs with </w:t>
-      </w:r>
-      <w:proofErr w:type="spellStart"/>
-      <w:proofErr w:type="gramStart"/>
-      <w:r>
-        <w:t>think:false</w:t>
-      </w:r>
-      <w:proofErr w:type="spellEnd"/>
-      <w:proofErr w:type="gramEnd"/>
-      <w:r>
-        <w:t xml:space="preserve"> so qwen3 no longer exhausts its token budget on hidden reasoning before answering.</w:t>
+      <w:r>
+        <w:t xml:space="preserve">Ollama now runs with think:false so qwen3 no longer exhausts its token budget on hidden reasoning before answering.</w:t>
       </w:r>
     </w:p>
     <w:p>
@@ -252,15 +190,7 @@
         <w:spacing w:after="60"/>
       </w:pPr>
       <w:r>
-        <w:t>Embedding model is cached for offline use and reported in /</w:t>
-      </w:r>
-      <w:proofErr w:type="spellStart"/>
-      <w:r>
-        <w:t>api</w:t>
-      </w:r>
-      <w:proofErr w:type="spellEnd"/>
-      <w:r>
-        <w:t>/health; the model is kept loaded to avoid cold-start delays.</w:t>
+        <w:t>Embedding model is cached for offline use and reported in /api/health; the model is kept loaded to avoid cold-start delays.</w:t>
       </w:r>
     </w:p>
     <w:p>
@@ -273,15 +203,7 @@
         <w:spacing w:after="60"/>
       </w:pPr>
       <w:r>
-        <w:t xml:space="preserve">Tokens, rate limits and chat sessions moved into </w:t>
-      </w:r>
-      <w:proofErr w:type="gramStart"/>
-      <w:r>
-        <w:t>Postgres</w:t>
-      </w:r>
-      <w:proofErr w:type="gramEnd"/>
-      <w:r>
-        <w:t xml:space="preserve"> so a restart no longer logs everyone out; connection pooling and an upload thread cap were added.</w:t>
+        <w:t xml:space="preserve">Tokens, rate limits and chat sessions moved into Postgres so a restart no longer logs everyone out; connection pooling and an upload thread cap were added.</w:t>
       </w:r>
     </w:p>
     <w:p>
@@ -294,15 +216,7 @@
         <w:spacing w:after="60"/>
       </w:pPr>
       <w:r>
-        <w:t xml:space="preserve">Swapped the Flask development server for a production-grade WSGI </w:t>
-      </w:r>
-      <w:proofErr w:type="gramStart"/>
-      <w:r>
-        <w:t>server, and</w:t>
-      </w:r>
-      <w:proofErr w:type="gramEnd"/>
-      <w:r>
-        <w:t xml:space="preserve"> confirmed the document corpus survives a restart.</w:t>
+        <w:t xml:space="preserve">Swapped the Flask development server for a production-grade WSGI server, and confirmed the document corpus survives a restart.</w:t>
       </w:r>
     </w:p>
     <w:p>
@@ -381,15 +295,7 @@
         <w:spacing w:after="60"/>
       </w:pPr>
       <w:r>
-        <w:t xml:space="preserve">Shipped the signup/login screens, course </w:t>
-      </w:r>
-      <w:proofErr w:type="spellStart"/>
-      <w:r>
-        <w:t>catalog</w:t>
-      </w:r>
-      <w:proofErr w:type="spellEnd"/>
-      <w:r>
-        <w:t xml:space="preserve"> and self-enrol screen, and the live-config and response-style-picker UI, removing the remaining hardcoded prompts.</w:t>
+        <w:t xml:space="preserve">Shipped the signup/login screens and removed the remaining hardcoded prompts. Backend delivered, UI in Sprint 9: live-config (global and per-course) and the five response-style presets are implemented and enforced server-side, but have no screen yet - a student or lecturer cannot reach either from the UI. The course catalog and self-enrol screen have the same gap: My Courses lists every course, but the button only switches which course is being viewed and does not enrol the student, so questions afterwards fail.</w:t>
       </w:r>
     </w:p>
     <w:p>
@@ -456,15 +362,7 @@
         <w:spacing w:after="60"/>
       </w:pPr>
       <w:r>
-        <w:t xml:space="preserve">Verified students cannot see or reach anything outside their </w:t>
-      </w:r>
-      <w:proofErr w:type="gramStart"/>
-      <w:r>
-        <w:t>permissions, and</w:t>
-      </w:r>
-      <w:proofErr w:type="gramEnd"/>
-      <w:r>
-        <w:t xml:space="preserve"> tested two concurrent users in two roles simultaneously.</w:t>
+        <w:t xml:space="preserve">Verified students cannot see or reach anything outside their permissions, and tested two concurrent users in two roles simultaneously.</w:t>
       </w:r>
     </w:p>
     <w:p>
@@ -477,15 +375,7 @@
         <w:spacing w:after="60"/>
       </w:pPr>
       <w:r>
-        <w:t xml:space="preserve">Load-tested concurrent questions to set </w:t>
-      </w:r>
-      <w:proofErr w:type="gramStart"/>
-      <w:r>
-        <w:t>parallelism, and</w:t>
-      </w:r>
-      <w:proofErr w:type="gramEnd"/>
-      <w:r>
-        <w:t xml:space="preserve"> ran a full regression across everything changed in the sprint.</w:t>
+        <w:t xml:space="preserve">Load-tested concurrent questions to set parallelism, and ran a full regression across everything changed in the sprint.</w:t>
       </w:r>
     </w:p>
     <w:p>
@@ -561,15 +451,7 @@
         <w:spacing w:after="60"/>
       </w:pPr>
       <w:r>
-        <w:t xml:space="preserve">Technical depth documentation: alongside front-end demonstrations that highlight </w:t>
-      </w:r>
-      <w:proofErr w:type="spellStart"/>
-      <w:r>
-        <w:t>EduRAG's</w:t>
-      </w:r>
-      <w:proofErr w:type="spellEnd"/>
-      <w:r>
-        <w:t xml:space="preserve"> value with concrete examples, the team should produce material explaining the technical side — the system's components, workflow, how data is retrieved and converted, and how a query is processed. This does not need to be part of the live application; it can be a slide deck, an HTML page, or a short video, and can reuse the backend architecture detail already documented in Assessment 1 and 2.</w:t>
+        <w:t xml:space="preserve">Technical depth documentation: alongside front-end demonstrations that highlight EduRAG's value with concrete examples, the team should produce material explaining the technical side — the system's components, workflow, how data is retrieved and converted, and how a query is processed. This does not need to be part of the live application; it can be a slide deck, an HTML page, or a short video, and can reuse the backend architecture detail already documented in Assessment 1 and 2.</w:t>
       </w:r>
     </w:p>
     <w:p>
@@ -595,15 +477,7 @@
         <w:spacing w:after="60"/>
       </w:pPr>
       <w:r>
-        <w:t xml:space="preserve">Timeline: per Moodle, the final product is due in 51 </w:t>
-      </w:r>
-      <w:proofErr w:type="gramStart"/>
-      <w:r>
-        <w:t>days</w:t>
-      </w:r>
-      <w:proofErr w:type="gramEnd"/>
-      <w:r>
-        <w:t xml:space="preserve"> and the tech expo (expected end of October) is in 58 days. Development work should be substantially finished within the next month; after that, the team's focus shifts entirely to documentation, marketing and bug fixing — no further new features.</w:t>
+        <w:t xml:space="preserve">Timeline: per Moodle, the final product is due in 51 days and the tech expo (expected end of October) is in 58 days. Development work should be substantially finished within the next month; after that, the team's focus shifts entirely to documentation, marketing and bug fixing — no further new features.</w:t>
       </w:r>
     </w:p>
     <w:p>
@@ -812,7 +686,7 @@
           </w:tcPr>
           <w:p>
             <w:r>
-              <w:t>Sponsor Meeting (Meeting No. 17) — 02 September 2026, 9:30 AM, Webex. Filed at docs/meetings/sprint8_sponsor_meeting.docx.</w:t>
+              <w:t>Sponsor Meeting (Meeting No. 17) — 02 September 2026, 9:30 AM, Webex. No separate meeting-minutes file is committed to the repo; this sponsor review document is the meeting record. Filed at docs/meetings/sprint8_sponsor_review.docx.</w:t>
             </w:r>
           </w:p>
         </w:tc>
@@ -1739,25 +1613,7 @@
           <w:iCs/>
           <w:color w:val="000000"/>
         </w:rPr>
-        <w:t xml:space="preserve">Document prepared by: Tung Phuong Anh </w:t>
-      </w:r>
-      <w:proofErr w:type="gramStart"/>
-      <w:r>
-        <w:rPr>
-          <w:i/>
-          <w:iCs/>
-          <w:color w:val="000000"/>
-        </w:rPr>
-        <w:t>Huynh  |</w:t>
-      </w:r>
-      <w:proofErr w:type="gramEnd"/>
-      <w:r>
-        <w:rPr>
-          <w:i/>
-          <w:iCs/>
-          <w:color w:val="000000"/>
-        </w:rPr>
-        <w:t xml:space="preserve">  CSIT321 Project 37, Group 19</w:t>
+        <w:t xml:space="preserve">Document prepared by: Tung Phuong Anh Huynh  |  CSIT321 Project 37, Group 19</w:t>
       </w:r>
     </w:p>
     <w:p>

</xml_diff>